<commit_message>
Restructure site around making-and-building through-line; update CV
Rewrite the site so a hiring committee can identify the unifying question
(what do we learn by building things?) and read three de-jargoned research
areas in under a minute: Philosophy of Science, Cognitive Science & AI,
and Applied Ethics. CV updated to two AOS (Philosophy of Science;
Cognitive Science & Artificial Intelligence) and adds Phil 2400 Minds and
Machines (Fall 2026, Bowdoin College) to instructor of record. Empty
ai-news page and links removed; research.html structural bug fixed; new
headshot.

Co-Authored-By: Claude Opus 4.7 (1M context) <noreply@anthropic.com>
</commit_message>
<xml_diff>
--- a/assets/Lucken_CV.docx
+++ b/assets/Lucken_CV.docx
@@ -187,7 +187,7 @@
         <w:t xml:space="preserve"> </w:t>
       </w:r>
       <w:r>
-        <w:t xml:space="preserve">Philosophy of Science, Cognitive Science, Artificial Intelligence  </w:t>
+        <w:t xml:space="preserve">Philosophy of Science; Cognitive Science &amp; Artificial Intelligence  </w:t>
       </w:r>
     </w:p>
     <w:p>
@@ -413,15 +413,7 @@
         <w:ind w:left="13" w:right="277"/>
       </w:pPr>
       <w:r>
-        <w:t xml:space="preserve">MEng. (2024). Robotics and Intelligent Autonomous Systems, University of Cincinnati Capstone: Biomimetic </w:t>
-      </w:r>
-      <w:proofErr w:type="spellStart"/>
-      <w:r>
-        <w:t>Vibrissal</w:t>
-      </w:r>
-      <w:proofErr w:type="spellEnd"/>
-      <w:r>
-        <w:t xml:space="preserve"> Sensing for Smart Sewer Robots </w:t>
+        <w:t xml:space="preserve">MEng. (2024). Robotics and Intelligent Autonomous Systems, University of Cincinnati Capstone: Biomimetic Vibrissal Sensing for Smart Sewer Robots </w:t>
       </w:r>
     </w:p>
     <w:p>
@@ -1075,15 +1067,7 @@
         <w:ind w:left="13"/>
       </w:pPr>
       <w:r>
-        <w:t>“</w:t>
-      </w:r>
-      <w:proofErr w:type="spellStart"/>
-      <w:r>
-        <w:t>Mindshaping</w:t>
-      </w:r>
-      <w:proofErr w:type="spellEnd"/>
-      <w:r>
-        <w:t xml:space="preserve"> and Learner Centered Pedagogy: A Revealing Harmony” With W. John Koolage. (Under Review. Draft available) </w:t>
+        <w:t xml:space="preserve">“Mindshaping and Learner Centered Pedagogy: A Revealing Harmony” With W. John Koolage. (Under Review. Draft available) </w:t>
       </w:r>
     </w:p>
     <w:p>
@@ -1337,15 +1321,7 @@
         <w:ind w:left="13"/>
       </w:pPr>
       <w:r>
-        <w:t xml:space="preserve">Charles Phelps Taft Dissertation Fellowship Award (2023 - 2024), University of Cincinnati Educational Fellowship (2023), National Science Foundation, Institute for Intelligence </w:t>
-      </w:r>
-      <w:proofErr w:type="spellStart"/>
-      <w:r>
-        <w:t>Cyberinfrastucture</w:t>
-      </w:r>
-      <w:proofErr w:type="spellEnd"/>
-      <w:r>
-        <w:t xml:space="preserve"> with Computational Learning in the Environment </w:t>
+        <w:t xml:space="preserve">Charles Phelps Taft Dissertation Fellowship Award (2023 - 2024), University of Cincinnati Educational Fellowship (2023), National Science Foundation, Institute for Intelligence Cyberinfrastucture with Computational Learning in the Environment </w:t>
       </w:r>
     </w:p>
     <w:p>
@@ -1563,15 +1539,7 @@
         <w:ind w:left="13" w:right="1982"/>
       </w:pPr>
       <w:r>
-        <w:t xml:space="preserve">July 2024. “On </w:t>
-      </w:r>
-      <w:proofErr w:type="spellStart"/>
-      <w:r>
-        <w:t>Carnap’s</w:t>
-      </w:r>
-      <w:proofErr w:type="spellEnd"/>
-      <w:r>
-        <w:t xml:space="preserve"> Language Engineering.” The Fifteenth Biennial Congress of the International Society for the History of Philosophy of Science. Vienna, Austria. </w:t>
+        <w:t xml:space="preserve">July 2024. “On Carnap’s Language Engineering.” The Fifteenth Biennial Congress of the International Society for the History of Philosophy of Science. Vienna, Austria. </w:t>
       </w:r>
     </w:p>
     <w:p>
@@ -1605,15 +1573,7 @@
         <w:ind w:left="13"/>
       </w:pPr>
       <w:r>
-        <w:t xml:space="preserve">June 2023. “Revisiting </w:t>
-      </w:r>
-      <w:proofErr w:type="spellStart"/>
-      <w:r>
-        <w:t>Tredgold’s</w:t>
-      </w:r>
-      <w:proofErr w:type="spellEnd"/>
-      <w:r>
-        <w:t xml:space="preserve"> Definition of Engineering.” 23rd Biennial International Conference of the Society for Philosophy and Technology. Tokyo, Japan. </w:t>
+        <w:t xml:space="preserve">June 2023. “Revisiting Tredgold’s Definition of Engineering.” 23rd Biennial International Conference of the Society for Philosophy and Technology. Tokyo, Japan. </w:t>
       </w:r>
       <w:r>
         <w:rPr>
@@ -1671,15 +1631,7 @@
         <w:ind w:left="13"/>
       </w:pPr>
       <w:r>
-        <w:t xml:space="preserve">May 2022. “What Does It Mean to Think Like an Engineer? Reflections on Method in Research in Sensing.” </w:t>
-      </w:r>
-      <w:proofErr w:type="spellStart"/>
-      <w:r>
-        <w:t>IRiS</w:t>
-      </w:r>
-      <w:proofErr w:type="spellEnd"/>
-      <w:r>
-        <w:t xml:space="preserve"> Ignite: An Annual Expo &amp; Festival of Sensing. Cincinnati, Ohio.  </w:t>
+        <w:t xml:space="preserve">May 2022. “What Does It Mean to Think Like an Engineer? Reflections on Method in Research in Sensing.” IRiS Ignite: An Annual Expo &amp; Festival of Sensing. Cincinnati, Ohio.  </w:t>
       </w:r>
     </w:p>
     <w:p>
@@ -2455,23 +2407,7 @@
         <w:ind w:left="13"/>
       </w:pPr>
       <w:r>
-        <w:t xml:space="preserve">Article Reviewer: </w:t>
-      </w:r>
-      <w:proofErr w:type="spellStart"/>
-      <w:r>
-        <w:t>Erkenntnis</w:t>
-      </w:r>
-      <w:proofErr w:type="spellEnd"/>
-      <w:r>
-        <w:t xml:space="preserve"> (2024), Philosophy of Science (2024), </w:t>
-      </w:r>
-      <w:proofErr w:type="spellStart"/>
-      <w:r>
-        <w:t>Synthese</w:t>
-      </w:r>
-      <w:proofErr w:type="spellEnd"/>
-      <w:r>
-        <w:t xml:space="preserve"> (2022, 2024), </w:t>
+        <w:t xml:space="preserve">Article Reviewer: Erkenntnis (2024), Philosophy of Science (2024), Synthese (2022, 2024), </w:t>
       </w:r>
     </w:p>
     <w:p>
@@ -2822,6 +2758,23 @@
         <w:ind w:left="13"/>
       </w:pPr>
       <w:r>
+        <w:t xml:space="preserve">Phil 2400, Minds and Machines, Fall 2026, Bowdoin College </w:t>
+      </w:r>
+    </w:p>
+    <w:p>
+      <w:pPr>
+        <w:spacing w:after="0" w:line="259" w:lineRule="auto"/>
+        <w:ind w:left="0"/>
+      </w:pPr>
+      <w:r>
+        <w:t xml:space="preserve"> </w:t>
+      </w:r>
+    </w:p>
+    <w:p>
+      <w:pPr>
+        <w:ind w:left="13"/>
+      </w:pPr>
+      <w:r>
         <w:t xml:space="preserve">As Teaching Assistant: </w:t>
       </w:r>
     </w:p>
@@ -3038,15 +2991,7 @@
         <w:ind w:left="13" w:right="6046"/>
       </w:pPr>
       <w:r>
-        <w:t xml:space="preserve">Professor </w:t>
-      </w:r>
-      <w:proofErr w:type="gramStart"/>
-      <w:r>
-        <w:t>of</w:t>
-      </w:r>
-      <w:proofErr w:type="gramEnd"/>
-      <w:r>
-        <w:t xml:space="preserve"> Philosophy University of Cincinnati</w:t>
+        <w:t>Professor of Philosophy University of Cincinnati</w:t>
       </w:r>
       <w:r>
         <w:rPr>
@@ -3135,15 +3080,7 @@
         <w:ind w:left="13" w:right="6046"/>
       </w:pPr>
       <w:r>
-        <w:t xml:space="preserve">Professor </w:t>
-      </w:r>
-      <w:proofErr w:type="gramStart"/>
-      <w:r>
-        <w:t>of</w:t>
-      </w:r>
-      <w:proofErr w:type="gramEnd"/>
-      <w:r>
-        <w:t xml:space="preserve"> Philosophy University of Cincinnati </w:t>
+        <w:t xml:space="preserve">Professor of Philosophy University of Cincinnati </w:t>
       </w:r>
       <w:r>
         <w:rPr>

</xml_diff>

<commit_message>
Add SAB 2026 paper to CV publications
Co-Authored-By: Claude Opus 4.8 <noreply@anthropic.com>
</commit_message>
<xml_diff>
--- a/assets/Lucken_CV.docx
+++ b/assets/Lucken_CV.docx
@@ -869,6 +869,14 @@
       </w:hyperlink>
       <w:r>
         <w:t xml:space="preserve"> </w:t>
+      </w:r>
+    </w:p>
+    <w:p>
+      <w:pPr>
+        <w:ind w:left="13"/>
+      </w:pPr>
+      <w:r>
+        <w:t>“When Does the Body Matter? A Dynamical Signature of Coupling Dependence in Evolved Neural Controllers,” Collin Lucken. From Animals to Animats 18: Proceedings of the 18th International Conference on the Simulation of Adaptive Behavior (SAB 2026), Berlin, Germany. (Forthcoming.)</w:t>
       </w:r>
     </w:p>
     <w:p>

</xml_diff>

<commit_message>
Order SAB 2026 paper above participatory paper; fix CV spacing
Co-Authored-By: Claude Opus 4.8 <noreply@anthropic.com>
</commit_message>
<xml_diff>
--- a/assets/Lucken_CV.docx
+++ b/assets/Lucken_CV.docx
@@ -846,6 +846,23 @@
         <w:ind w:left="13"/>
       </w:pPr>
       <w:r>
+        <w:t>“When Does the Body Matter? A Dynamical Signature of Coupling Dependence in Evolved Neural Controllers,” Collin Lucken. From Animals to Animats 18: Proceedings of the 18th International Conference on the Simulation of Adaptive Behavior (SAB 2026), Berlin, Germany. (Forthcoming.)</w:t>
+      </w:r>
+    </w:p>
+    <w:p>
+      <w:pPr>
+        <w:spacing w:after="4" w:line="259" w:lineRule="auto"/>
+        <w:ind w:left="0"/>
+      </w:pPr>
+      <w:r>
+        <w:t xml:space="preserve"> </w:t>
+      </w:r>
+    </w:p>
+    <w:p>
+      <w:pPr>
+        <w:ind w:left="13"/>
+      </w:pPr>
+      <w:r>
         <w:t>“Leveraging participatory sense-making and public engagement with science for AI democratization” , Collin Lucken, Tim Elmo Feiten, Studies in History and Philosophy of Science, Volume 110, 2025, Pages 55-64, ISSN 0039-3681,</w:t>
       </w:r>
       <w:hyperlink r:id="rId6">
@@ -869,14 +886,6 @@
       </w:hyperlink>
       <w:r>
         <w:t xml:space="preserve"> </w:t>
-      </w:r>
-    </w:p>
-    <w:p>
-      <w:pPr>
-        <w:ind w:left="13"/>
-      </w:pPr>
-      <w:r>
-        <w:t>“When Does the Body Matter? A Dynamical Signature of Coupling Dependence in Evolved Neural Controllers,” Collin Lucken. From Animals to Animats 18: Proceedings of the 18th International Conference on the Simulation of Adaptive Behavior (SAB 2026), Berlin, Germany. (Forthcoming.)</w:t>
       </w:r>
     </w:p>
     <w:p>

</xml_diff>